<commit_message>
Restructure la section contraintes en tableau contrainte / organisation
Remplace la liste de puces par une matrice à deux colonnes
(contrainte identifiée dans le DCE / organisation prévue par
France Décoration), couvrant compréhension du projet, enjeux
techniques et organisationnels, sécurité/coordination SSI-SPS,
risques, nettoyage et gestion des déchets, garanties.

Co-Authored-By: Claude Sonnet 5 <noreply@anthropic.com>
Claude-Session: https://claude.ai/code/session_016J8ZBxzUkBqS3C16QP9P63
</commit_message>
<xml_diff>
--- a/livrables/Analyse_AO_26RMB41TVX_Lot3.docx
+++ b/livrables/Analyse_AO_26RMB41TVX_Lot3.docx
@@ -3177,49 +3177,1141 @@
           <w:color w:val="2E74B5"/>
           <w:sz w:val="28"/>
         </w:rPr>
-        <w:t>6. Contraintes de site et sécurité</w:t>
+        <w:t>6. Contraintes du chantier et organisation prévue par France Décoration</w:t>
+      </w:r>
+    </w:p>
+    <w:p>
+      <w:r>
+        <w:rPr>
+          <w:b w:val="0"/>
+          <w:i w:val="0"/>
+          <w:sz w:val="21"/>
+        </w:rPr>
+        <w:t>Cette section met en regard, contrainte par contrainte (compréhension du projet, enjeux techniques et organisationnels, sécurité, risques, nettoyage), l'exigence identifiée dans le DCE et l'organisation proposée par France Décoration pour y répondre. Cette matrice constitue la base du futur mémoire technique (critère « Valeur technique », 60% de la note) — les réponses ci-dessous sont des propositions à valider, chiffrer et personnaliser avec les moyens réels de l'entreprise avant dépôt.</w:t>
       </w:r>
     </w:p>
     <w:p>
       <w:pPr>
-        <w:pStyle w:val="ListBullet"/>
+        <w:spacing w:before="200" w:after="80"/>
       </w:pPr>
       <w:r>
-        <w:t>Établissement recevant du public de type U (soins) avec locaux L, 3ᵉ catégorie, comportant des locaux à sommeil (hospitalisation) — SSI de catégorie A.</w:t>
+        <w:rPr>
+          <w:b/>
+          <w:color w:val="1F3A5F"/>
+          <w:sz w:val="23"/>
+        </w:rPr>
+        <w:t>6.1 Compréhension du projet et enjeux techniques</w:t>
       </w:r>
     </w:p>
+    <w:tbl>
+      <w:tblPr>
+        <w:tblStyle w:val="TableGrid"/>
+        <w:tblW w:type="auto" w:w="0"/>
+        <w:jc w:val="center"/>
+        <w:tblLook w:firstColumn="1" w:firstRow="1" w:lastColumn="0" w:lastRow="0" w:noHBand="0" w:noVBand="1" w:val="04A0"/>
+      </w:tblPr>
+      <w:tblGrid>
+        <w:gridCol w:w="4986"/>
+        <w:gridCol w:w="4986"/>
+      </w:tblGrid>
+      <w:tr>
+        <w:tc>
+          <w:tcPr>
+            <w:tcW w:type="dxa" w:w="4365"/>
+            <w:shd w:val="clear" w:color="auto" w:fill="2E74B5"/>
+          </w:tcPr>
+          <w:p>
+            <w:r/>
+            <w:r>
+              <w:rPr>
+                <w:b/>
+                <w:color w:val="FFFFFF"/>
+                <w:sz w:val="19"/>
+              </w:rPr>
+              <w:t>Contrainte identifiée dans le DCE</w:t>
+            </w:r>
+          </w:p>
+        </w:tc>
+        <w:tc>
+          <w:tcPr>
+            <w:tcW w:type="dxa" w:w="4422"/>
+            <w:shd w:val="clear" w:color="auto" w:fill="2E74B5"/>
+          </w:tcPr>
+          <w:p>
+            <w:r/>
+            <w:r>
+              <w:rPr>
+                <w:b/>
+                <w:color w:val="FFFFFF"/>
+                <w:sz w:val="19"/>
+              </w:rPr>
+              <w:t>Organisation prévue par France Décoration</w:t>
+            </w:r>
+          </w:p>
+        </w:tc>
+      </w:tr>
+      <w:tr>
+        <w:tc>
+          <w:tcPr>
+            <w:tcW w:type="dxa" w:w="4365"/>
+          </w:tcPr>
+          <w:p>
+            <w:r/>
+            <w:r>
+              <w:rPr>
+                <w:sz w:val="19"/>
+              </w:rPr>
+              <w:t>Réaménagement d'une ancienne zone de radiologie en salle de scanner (RDC, bâtiment Madeleine Brès), en établissement hospitalier en activité.</w:t>
+            </w:r>
+          </w:p>
+        </w:tc>
+        <w:tc>
+          <w:tcPr>
+            <w:tcW w:type="dxa" w:w="4422"/>
+          </w:tcPr>
+          <w:p>
+            <w:r/>
+            <w:r>
+              <w:rPr>
+                <w:sz w:val="19"/>
+              </w:rPr>
+              <w:t>Désignation d'un conducteur de travaux référent unique pour le lot, présent régulièrement sur site ; visite préalable approfondie pour lever toute ambiguïté avant chiffrage ; participation active aux réunions de la période de préparation.</w:t>
+            </w:r>
+          </w:p>
+        </w:tc>
+      </w:tr>
+      <w:tr>
+        <w:tc>
+          <w:tcPr>
+            <w:tcW w:type="dxa" w:w="4365"/>
+          </w:tcPr>
+          <w:p>
+            <w:r/>
+            <w:r>
+              <w:rPr>
+                <w:sz w:val="19"/>
+              </w:rPr>
+              <w:t>Ouvrages à forte exigence hygiène/technique : faux plafonds « Hygiène » (classement A2-s1,d0), sols UPEC U3P3E2/3C2, peintures faible C.O.V. certifiées Ecolabel.</w:t>
+            </w:r>
+          </w:p>
+        </w:tc>
+        <w:tc>
+          <w:tcPr>
+            <w:tcW w:type="dxa" w:w="4422"/>
+          </w:tcPr>
+          <w:p>
+            <w:r/>
+            <w:r>
+              <w:rPr>
+                <w:sz w:val="19"/>
+              </w:rPr>
+              <w:t>Mise en œuvre strictement conforme aux DTU et fiches techniques fabricants (Ecophon, Caparol, Gerflor) ; contrôle qualité interne à chaque étape ; validation d'échantillons et de locaux témoins avec le Maître d'Œuvre avant généralisation.</w:t>
+            </w:r>
+          </w:p>
+        </w:tc>
+      </w:tr>
+      <w:tr>
+        <w:tc>
+          <w:tcPr>
+            <w:tcW w:type="dxa" w:w="4365"/>
+          </w:tcPr>
+          <w:p>
+            <w:r/>
+            <w:r>
+              <w:rPr>
+                <w:sz w:val="19"/>
+              </w:rPr>
+              <w:t>Équipements lourds à supporter (statif scanner ≈2 676 daN, table patiente, armoires) nécessitant un plancher renforcé.</w:t>
+            </w:r>
+          </w:p>
+        </w:tc>
+        <w:tc>
+          <w:tcPr>
+            <w:tcW w:type="dxa" w:w="4422"/>
+          </w:tcPr>
+          <w:p>
+            <w:r/>
+            <w:r>
+              <w:rPr>
+                <w:sz w:val="19"/>
+              </w:rPr>
+              <w:t>Point d'arrêt formalisé avant intervention : constat contradictoire de réception du renfort structurel (poutrelles HEB220, Lot 1) avant toute pose de sol ou de faux plafond dans la zone concernée.</w:t>
+            </w:r>
+          </w:p>
+        </w:tc>
+      </w:tr>
+      <w:tr>
+        <w:tc>
+          <w:tcPr>
+            <w:tcW w:type="dxa" w:w="4365"/>
+          </w:tcPr>
+          <w:p>
+            <w:r/>
+            <w:r>
+              <w:rPr>
+                <w:sz w:val="19"/>
+              </w:rPr>
+              <w:t>Lot en toute fin de chaîne technique du chantier (après gros œuvre, cloisonnement, réseaux) — bonne compréhension des interfaces avec les lots 1, 2, 4, 5, 6 indispensable.</w:t>
+            </w:r>
+          </w:p>
+        </w:tc>
+        <w:tc>
+          <w:tcPr>
+            <w:tcW w:type="dxa" w:w="4422"/>
+          </w:tcPr>
+          <w:p>
+            <w:r/>
+            <w:r>
+              <w:rPr>
+                <w:sz w:val="19"/>
+              </w:rPr>
+              <w:t>Analyse des interfaces en phase de préparation (plans d'exécution visés, réservations, coordination réseaux/plénum) ; réunion de calage technique avec chaque corps d'état concerné avant démarrage.</w:t>
+            </w:r>
+          </w:p>
+        </w:tc>
+      </w:tr>
+    </w:tbl>
+    <w:p/>
     <w:p>
       <w:pPr>
-        <w:pStyle w:val="ListBullet"/>
+        <w:spacing w:before="200" w:after="80"/>
       </w:pPr>
       <w:r>
-        <w:t>Le lot n'est pas prescripteur SSI, mais devra respecter le maintien du niveau de sécurité pendant toute la durée des travaux : coordination avec le lot SSI dédié pour toute intervention en plénum ou sur cloisons coupe-feu.</w:t>
+        <w:rPr>
+          <w:b/>
+          <w:color w:val="1F3A5F"/>
+          <w:sz w:val="23"/>
+        </w:rPr>
+        <w:t>6.2 Enjeux organisationnels et planning</w:t>
       </w:r>
     </w:p>
+    <w:tbl>
+      <w:tblPr>
+        <w:tblStyle w:val="TableGrid"/>
+        <w:tblW w:type="auto" w:w="0"/>
+        <w:jc w:val="center"/>
+        <w:tblLook w:firstColumn="1" w:firstRow="1" w:lastColumn="0" w:lastRow="0" w:noHBand="0" w:noVBand="1" w:val="04A0"/>
+      </w:tblPr>
+      <w:tblGrid>
+        <w:gridCol w:w="4986"/>
+        <w:gridCol w:w="4986"/>
+      </w:tblGrid>
+      <w:tr>
+        <w:tc>
+          <w:tcPr>
+            <w:tcW w:type="dxa" w:w="4365"/>
+            <w:shd w:val="clear" w:color="auto" w:fill="2E74B5"/>
+          </w:tcPr>
+          <w:p>
+            <w:r/>
+            <w:r>
+              <w:rPr>
+                <w:b/>
+                <w:color w:val="FFFFFF"/>
+                <w:sz w:val="19"/>
+              </w:rPr>
+              <w:t>Contrainte identifiée dans le DCE</w:t>
+            </w:r>
+          </w:p>
+        </w:tc>
+        <w:tc>
+          <w:tcPr>
+            <w:tcW w:type="dxa" w:w="4422"/>
+            <w:shd w:val="clear" w:color="auto" w:fill="2E74B5"/>
+          </w:tcPr>
+          <w:p>
+            <w:r/>
+            <w:r>
+              <w:rPr>
+                <w:b/>
+                <w:color w:val="FFFFFF"/>
+                <w:sz w:val="19"/>
+              </w:rPr>
+              <w:t>Organisation prévue par France Décoration</w:t>
+            </w:r>
+          </w:p>
+        </w:tc>
+      </w:tr>
+      <w:tr>
+        <w:tc>
+          <w:tcPr>
+            <w:tcW w:type="dxa" w:w="4365"/>
+          </w:tcPr>
+          <w:p>
+            <w:r/>
+            <w:r>
+              <w:rPr>
+                <w:sz w:val="19"/>
+              </w:rPr>
+              <w:t>Fenêtre d'intervention courte (45 jours) et dépendante de l'avancement des lots amont (1, 2, 4, 5) — risque de glissement de planning.</w:t>
+            </w:r>
+          </w:p>
+        </w:tc>
+        <w:tc>
+          <w:tcPr>
+            <w:tcW w:type="dxa" w:w="4422"/>
+          </w:tcPr>
+          <w:p>
+            <w:r/>
+            <w:r>
+              <w:rPr>
+                <w:sz w:val="19"/>
+              </w:rPr>
+              <w:t>Planning d'exécution détaillé en sous-tâches par local, avec jalons de réception intermédiaires des supports ; anticipation des délais de fabrication/livraison (faux plafonds, sols, peintures) dès la notification ; réserve de capacité (équipes mobilisables en renfort) en cas de rattrapage nécessaire.</w:t>
+            </w:r>
+          </w:p>
+        </w:tc>
+      </w:tr>
+      <w:tr>
+        <w:tc>
+          <w:tcPr>
+            <w:tcW w:type="dxa" w:w="4365"/>
+          </w:tcPr>
+          <w:p>
+            <w:r/>
+            <w:r>
+              <w:rPr>
+                <w:sz w:val="19"/>
+              </w:rPr>
+              <w:t>Délai global contraint (5 mois dont 1 mois de préparation) et régime de pénalités sans mise en demeure préalable (retard, documents, RDV chantier, sous-traitants...).</w:t>
+            </w:r>
+          </w:p>
+        </w:tc>
+        <w:tc>
+          <w:tcPr>
+            <w:tcW w:type="dxa" w:w="4422"/>
+          </w:tcPr>
+          <w:p>
+            <w:r/>
+            <w:r>
+              <w:rPr>
+                <w:sz w:val="19"/>
+              </w:rPr>
+              <w:t>Cadencement hebdomadaire du chantier avec compte-rendu formalisé ; alerte anticipée écrite au Maître d'Œuvre dès qu'un retard d'un lot amont est identifié comme menaçant la fenêtre du Lot 3, pour purger la responsabilité de France Décoration.</w:t>
+            </w:r>
+          </w:p>
+        </w:tc>
+      </w:tr>
+      <w:tr>
+        <w:tc>
+          <w:tcPr>
+            <w:tcW w:type="dxa" w:w="4365"/>
+          </w:tcPr>
+          <w:p>
+            <w:r/>
+            <w:r>
+              <w:rPr>
+                <w:sz w:val="19"/>
+              </w:rPr>
+              <w:t>Engagement contractuel à souscrire : continuité des travaux et effectifs constants en période estivale (juin à août).</w:t>
+            </w:r>
+          </w:p>
+        </w:tc>
+        <w:tc>
+          <w:tcPr>
+            <w:tcW w:type="dxa" w:w="4422"/>
+          </w:tcPr>
+          <w:p>
+            <w:r/>
+            <w:r>
+              <w:rPr>
+                <w:sz w:val="19"/>
+              </w:rPr>
+              <w:t>Planification des congés des équipes affectées au chantier en dehors de la période juin-août ; identification d'un binôme/équipe de suppléance pour garantir la continuité.</w:t>
+            </w:r>
+          </w:p>
+        </w:tc>
+      </w:tr>
+      <w:tr>
+        <w:tc>
+          <w:tcPr>
+            <w:tcW w:type="dxa" w:w="4365"/>
+          </w:tcPr>
+          <w:p>
+            <w:r/>
+            <w:r>
+              <w:rPr>
+                <w:sz w:val="19"/>
+              </w:rPr>
+              <w:t>Coordination technique avec les autres corps d'état : réservations/découpes en faux plafond (électricité, CVC, fluides médicaux), pose de plinthes après sols, raccords après jeux des menuiseries.</w:t>
+            </w:r>
+          </w:p>
+        </w:tc>
+        <w:tc>
+          <w:tcPr>
+            <w:tcW w:type="dxa" w:w="4422"/>
+          </w:tcPr>
+          <w:p>
+            <w:r/>
+            <w:r>
+              <w:rPr>
+                <w:sz w:val="19"/>
+              </w:rPr>
+              <w:t>Participation systématique aux réunions de coordination technique hebdomadaires ; visa croisé des plans d'exécution avant pose ; désignation d'un référent coordination interfaces au sein de l'équipe chantier.</w:t>
+            </w:r>
+          </w:p>
+        </w:tc>
+      </w:tr>
+      <w:tr>
+        <w:tc>
+          <w:tcPr>
+            <w:tcW w:type="dxa" w:w="4365"/>
+          </w:tcPr>
+          <w:p>
+            <w:r/>
+            <w:r>
+              <w:rPr>
+                <w:sz w:val="19"/>
+              </w:rPr>
+              <w:t>Sous-traitance éventuelle à déclarer et faire agréer (délais compatibles avec le PPSPS du sous-traitant).</w:t>
+            </w:r>
+          </w:p>
+        </w:tc>
+        <w:tc>
+          <w:tcPr>
+            <w:tcW w:type="dxa" w:w="4422"/>
+          </w:tcPr>
+          <w:p>
+            <w:r/>
+            <w:r>
+              <w:rPr>
+                <w:sz w:val="19"/>
+              </w:rPr>
+              <w:t>Anticipation des demandes d'agrément sous-traitant dès la notification du marché, avec constitution des pièces (déclarations, attestations) en parallèle du démarrage de chantier.</w:t>
+            </w:r>
+          </w:p>
+        </w:tc>
+      </w:tr>
+    </w:tbl>
+    <w:p/>
     <w:p>
       <w:pPr>
-        <w:pStyle w:val="ListBullet"/>
+        <w:spacing w:before="200" w:after="80"/>
       </w:pPr>
       <w:r>
-        <w:t>Coordination SPS assurée par SOCOTEC Construction ; contrôle technique par ALPHA CONTROLE SAS.</w:t>
+        <w:rPr>
+          <w:b/>
+          <w:color w:val="1F3A5F"/>
+          <w:sz w:val="23"/>
+        </w:rPr>
+        <w:t>6.3 Sécurité du chantier et coordination SSI/SPS</w:t>
       </w:r>
     </w:p>
+    <w:tbl>
+      <w:tblPr>
+        <w:tblStyle w:val="TableGrid"/>
+        <w:tblW w:type="auto" w:w="0"/>
+        <w:jc w:val="center"/>
+        <w:tblLook w:firstColumn="1" w:firstRow="1" w:lastColumn="0" w:lastRow="0" w:noHBand="0" w:noVBand="1" w:val="04A0"/>
+      </w:tblPr>
+      <w:tblGrid>
+        <w:gridCol w:w="4986"/>
+        <w:gridCol w:w="4986"/>
+      </w:tblGrid>
+      <w:tr>
+        <w:tc>
+          <w:tcPr>
+            <w:tcW w:type="dxa" w:w="4365"/>
+            <w:shd w:val="clear" w:color="auto" w:fill="2E74B5"/>
+          </w:tcPr>
+          <w:p>
+            <w:r/>
+            <w:r>
+              <w:rPr>
+                <w:b/>
+                <w:color w:val="FFFFFF"/>
+                <w:sz w:val="19"/>
+              </w:rPr>
+              <w:t>Contrainte identifiée dans le DCE</w:t>
+            </w:r>
+          </w:p>
+        </w:tc>
+        <w:tc>
+          <w:tcPr>
+            <w:tcW w:type="dxa" w:w="4422"/>
+            <w:shd w:val="clear" w:color="auto" w:fill="2E74B5"/>
+          </w:tcPr>
+          <w:p>
+            <w:r/>
+            <w:r>
+              <w:rPr>
+                <w:b/>
+                <w:color w:val="FFFFFF"/>
+                <w:sz w:val="19"/>
+              </w:rPr>
+              <w:t>Organisation prévue par France Décoration</w:t>
+            </w:r>
+          </w:p>
+        </w:tc>
+      </w:tr>
+      <w:tr>
+        <w:tc>
+          <w:tcPr>
+            <w:tcW w:type="dxa" w:w="4365"/>
+          </w:tcPr>
+          <w:p>
+            <w:r/>
+            <w:r>
+              <w:rPr>
+                <w:sz w:val="19"/>
+              </w:rPr>
+              <w:t>Coordination SPS assurée par SOCOTEC Construction ; PPSPS à établir et remettre sous 30 jours à compter du début de la période de préparation.</w:t>
+            </w:r>
+          </w:p>
+        </w:tc>
+        <w:tc>
+          <w:tcPr>
+            <w:tcW w:type="dxa" w:w="4422"/>
+          </w:tcPr>
+          <w:p>
+            <w:r/>
+            <w:r>
+              <w:rPr>
+                <w:sz w:val="19"/>
+              </w:rPr>
+              <w:t>Élaboration et transmission du PPSPS dans les délais impartis, après inspection commune ; mise à jour immédiate en cas de modification des conditions d'intervention ou de sous-traitance.</w:t>
+            </w:r>
+          </w:p>
+        </w:tc>
+      </w:tr>
+      <w:tr>
+        <w:tc>
+          <w:tcPr>
+            <w:tcW w:type="dxa" w:w="4365"/>
+          </w:tcPr>
+          <w:p>
+            <w:r/>
+            <w:r>
+              <w:rPr>
+                <w:sz w:val="19"/>
+              </w:rPr>
+              <w:t>Obligations générales de sécurité chantier : port permanent d'un badge d'identification (personne + employeur), tenue d'un registre exhaustif du personnel présent, respect des consignes du coordonnateur SPS.</w:t>
+            </w:r>
+          </w:p>
+        </w:tc>
+        <w:tc>
+          <w:tcPr>
+            <w:tcW w:type="dxa" w:w="4422"/>
+          </w:tcPr>
+          <w:p>
+            <w:r/>
+            <w:r>
+              <w:rPr>
+                <w:sz w:val="19"/>
+              </w:rPr>
+              <w:t>Fourniture et contrôle du port du badge pour toute personne intervenant (y compris sous-traitants) ; tenue à jour du registre du personnel, transmis sur demande sans délai.</w:t>
+            </w:r>
+          </w:p>
+        </w:tc>
+      </w:tr>
+      <w:tr>
+        <w:tc>
+          <w:tcPr>
+            <w:tcW w:type="dxa" w:w="4365"/>
+          </w:tcPr>
+          <w:p>
+            <w:r/>
+            <w:r>
+              <w:rPr>
+                <w:sz w:val="19"/>
+              </w:rPr>
+              <w:t>Établissement classé ERP type U (soins) / L, 3ᵉ catégorie, avec locaux à sommeil — SSI de catégorie A ; le Lot 3 n'est pas prescripteur SSI mais doit maintenir le niveau de sécurité incendie pendant toute la durée des travaux.</w:t>
+            </w:r>
+          </w:p>
+        </w:tc>
+        <w:tc>
+          <w:tcPr>
+            <w:tcW w:type="dxa" w:w="4422"/>
+          </w:tcPr>
+          <w:p>
+            <w:r/>
+            <w:r>
+              <w:rPr>
+                <w:sz w:val="19"/>
+              </w:rPr>
+              <w:t>Coordination avec le lot SSI dédié (CS Ingénierie) pour toute intervention à proximité de cloisons coupe-feu ou de plénums de faux plafonds ; respect du classement au feu M0/A2-s1,d0 imposé en circulations et locaux à sommeil ; aucune intervention sur DAS sans validation du coordonnateur SSI.</w:t>
+            </w:r>
+          </w:p>
+        </w:tc>
+      </w:tr>
+      <w:tr>
+        <w:tc>
+          <w:tcPr>
+            <w:tcW w:type="dxa" w:w="4365"/>
+          </w:tcPr>
+          <w:p>
+            <w:r/>
+            <w:r>
+              <w:rPr>
+                <w:sz w:val="19"/>
+              </w:rPr>
+              <w:t>Intervention en établissement de soins en activité : circulation de patients/personnel, contraintes d'accès et de nuisances (bruit, poussières, odeurs).</w:t>
+            </w:r>
+          </w:p>
+        </w:tc>
+        <w:tc>
+          <w:tcPr>
+            <w:tcW w:type="dxa" w:w="4422"/>
+          </w:tcPr>
+          <w:p>
+            <w:r/>
+            <w:r>
+              <w:rPr>
+                <w:sz w:val="19"/>
+              </w:rPr>
+              <w:t>Cloisonnement de chantier étanche et signalétique dédiée ; plages d'intervention bruyantes convenues à l'avance avec l'exploitant ; procédure d'accès chantier formalisée avec la loge/sécurité de l'hôpital.</w:t>
+            </w:r>
+          </w:p>
+        </w:tc>
+      </w:tr>
+    </w:tbl>
+    <w:p/>
     <w:p>
       <w:pPr>
-        <w:pStyle w:val="ListBullet"/>
+        <w:spacing w:before="200" w:after="80"/>
       </w:pPr>
       <w:r>
-        <w:t>Diagnostic structurel GEOTEC : déficit de portance identifié sur le plancher/poutre de la zone scanner (sous-sol) — renforcement par profilés HEB 220 nécessaire (à la charge du Lot 1, PSE4 « plancher renforcé »). Le Lot 3 ne peut intervenir (pose de sols et faux plafonds) qu'une fois ce renfort réceptionné : point de vigilance sur le planning et sur la réception préalable des supports.</w:t>
+        <w:rPr>
+          <w:b/>
+          <w:color w:val="1F3A5F"/>
+          <w:sz w:val="23"/>
+        </w:rPr>
+        <w:t>6.4 Risques identifiés et mesures associées</w:t>
       </w:r>
     </w:p>
+    <w:tbl>
+      <w:tblPr>
+        <w:tblStyle w:val="TableGrid"/>
+        <w:tblW w:type="auto" w:w="0"/>
+        <w:jc w:val="center"/>
+        <w:tblLook w:firstColumn="1" w:firstRow="1" w:lastColumn="0" w:lastRow="0" w:noHBand="0" w:noVBand="1" w:val="04A0"/>
+      </w:tblPr>
+      <w:tblGrid>
+        <w:gridCol w:w="4986"/>
+        <w:gridCol w:w="4986"/>
+      </w:tblGrid>
+      <w:tr>
+        <w:tc>
+          <w:tcPr>
+            <w:tcW w:type="dxa" w:w="4365"/>
+            <w:shd w:val="clear" w:color="auto" w:fill="2E74B5"/>
+          </w:tcPr>
+          <w:p>
+            <w:r/>
+            <w:r>
+              <w:rPr>
+                <w:b/>
+                <w:color w:val="FFFFFF"/>
+                <w:sz w:val="19"/>
+              </w:rPr>
+              <w:t>Contrainte identifiée dans le DCE</w:t>
+            </w:r>
+          </w:p>
+        </w:tc>
+        <w:tc>
+          <w:tcPr>
+            <w:tcW w:type="dxa" w:w="4422"/>
+            <w:shd w:val="clear" w:color="auto" w:fill="2E74B5"/>
+          </w:tcPr>
+          <w:p>
+            <w:r/>
+            <w:r>
+              <w:rPr>
+                <w:b/>
+                <w:color w:val="FFFFFF"/>
+                <w:sz w:val="19"/>
+              </w:rPr>
+              <w:t>Organisation prévue par France Décoration</w:t>
+            </w:r>
+          </w:p>
+        </w:tc>
+      </w:tr>
+      <w:tr>
+        <w:tc>
+          <w:tcPr>
+            <w:tcW w:type="dxa" w:w="4365"/>
+          </w:tcPr>
+          <w:p>
+            <w:r/>
+            <w:r>
+              <w:rPr>
+                <w:sz w:val="19"/>
+              </w:rPr>
+              <w:t>Risque structurel : déficit de portance du plancher/poutre en zone scanner mis en évidence par le diagnostic GEOTEC (renfort HEB220 à réaliser par le Lot 1 avant intervention du Lot 3).</w:t>
+            </w:r>
+          </w:p>
+        </w:tc>
+        <w:tc>
+          <w:tcPr>
+            <w:tcW w:type="dxa" w:w="4422"/>
+          </w:tcPr>
+          <w:p>
+            <w:r/>
+            <w:r>
+              <w:rPr>
+                <w:sz w:val="19"/>
+              </w:rPr>
+              <w:t>Point d'arrêt contractuel : aucune pose de sol ou de faux plafond dans la zone concernée avant réception écrite (PV contradictoire) du renfort structurel ; clause de report d'activité sans pénalité en cas de non-disponibilité du support à la date prévue.</w:t>
+            </w:r>
+          </w:p>
+        </w:tc>
+      </w:tr>
+      <w:tr>
+        <w:tc>
+          <w:tcPr>
+            <w:tcW w:type="dxa" w:w="4365"/>
+          </w:tcPr>
+          <w:p>
+            <w:r/>
+            <w:r>
+              <w:rPr>
+                <w:sz w:val="19"/>
+              </w:rPr>
+              <w:t>Risque de coactivité avec les lots 1/2/4/5/6 intervenant en parallèle ou juste avant (salissures, dégradation d'ouvrages finis).</w:t>
+            </w:r>
+          </w:p>
+        </w:tc>
+        <w:tc>
+          <w:tcPr>
+            <w:tcW w:type="dxa" w:w="4422"/>
+          </w:tcPr>
+          <w:p>
+            <w:r/>
+            <w:r>
+              <w:rPr>
+                <w:sz w:val="19"/>
+              </w:rPr>
+              <w:t>Phasage des interventions du lot (peinture puis sols en toute fin de séquence par local) ; protection systématique des ouvrages finis (bâches, films, plaques de protection de sol) ; constat contradictoire d'état des lieux à chaque prise et remise de zone.</w:t>
+            </w:r>
+          </w:p>
+        </w:tc>
+      </w:tr>
+      <w:tr>
+        <w:tc>
+          <w:tcPr>
+            <w:tcW w:type="dxa" w:w="4365"/>
+          </w:tcPr>
+          <w:p>
+            <w:r/>
+            <w:r>
+              <w:rPr>
+                <w:sz w:val="19"/>
+              </w:rPr>
+              <w:t>Risque sanitaire/environnemental : poussières et émissions de COV liées à la peinture et au ponçage, à proximité de zones de soins en activité.</w:t>
+            </w:r>
+          </w:p>
+        </w:tc>
+        <w:tc>
+          <w:tcPr>
+            <w:tcW w:type="dxa" w:w="4422"/>
+          </w:tcPr>
+          <w:p>
+            <w:r/>
+            <w:r>
+              <w:rPr>
+                <w:sz w:val="19"/>
+              </w:rPr>
+              <w:t>Emploi systématique des peintures à très faible émission de C.O.V. certifiées Ecolabel prescrites (Caparol Indeko) ; confinement de la zone de travaux (bâches, sas) ; aspiration à la source lors des opérations de ponçage.</w:t>
+            </w:r>
+          </w:p>
+        </w:tc>
+      </w:tr>
+      <w:tr>
+        <w:tc>
+          <w:tcPr>
+            <w:tcW w:type="dxa" w:w="4365"/>
+          </w:tcPr>
+          <w:p>
+            <w:r/>
+            <w:r>
+              <w:rPr>
+                <w:sz w:val="19"/>
+              </w:rPr>
+              <w:t>Risque lié aux ouvrages existants à déposer (faux plafonds ~67 m², revêtements muraux) dans un bâtiment ancien : présence possible de matériaux amiantés/plombés non purgée par le CCTP.</w:t>
+            </w:r>
+          </w:p>
+        </w:tc>
+        <w:tc>
+          <w:tcPr>
+            <w:tcW w:type="dxa" w:w="4422"/>
+          </w:tcPr>
+          <w:p>
+            <w:r/>
+            <w:r>
+              <w:rPr>
+                <w:sz w:val="19"/>
+              </w:rPr>
+              <w:t>Demande formelle au Maître d'Ouvrage/MOE du diagnostic amiante-avant-travaux (DAAT) et du repérage plomb applicables à la zone, avant tout commencement de dépose ; procédure de retrait adaptée par une entreprise habilitée si nécessaire, avec suspension du chantier dans l'attente.</w:t>
+            </w:r>
+          </w:p>
+        </w:tc>
+      </w:tr>
+      <w:tr>
+        <w:tc>
+          <w:tcPr>
+            <w:tcW w:type="dxa" w:w="4365"/>
+          </w:tcPr>
+          <w:p>
+            <w:r/>
+            <w:r>
+              <w:rPr>
+                <w:sz w:val="19"/>
+              </w:rPr>
+              <w:t>Risque financier : pénalités cumulables et sans mise en demeure préalable (bruit 500€/j, hygiène/sécurité 200€/j, gravois 200€/infraction, RDV manqué 200€...).</w:t>
+            </w:r>
+          </w:p>
+        </w:tc>
+        <w:tc>
+          <w:tcPr>
+            <w:tcW w:type="dxa" w:w="4422"/>
+          </w:tcPr>
+          <w:p>
+            <w:r/>
+            <w:r>
+              <w:rPr>
+                <w:sz w:val="19"/>
+              </w:rPr>
+              <w:t>Auto-contrôle hebdomadaire des points sensibles (propreté, sécurité, stockage gravois) formalisé par une check-list interne ; anticipation systématique des rendez-vous de coordination pour éviter les absences.</w:t>
+            </w:r>
+          </w:p>
+        </w:tc>
+      </w:tr>
+    </w:tbl>
+    <w:p/>
     <w:p>
       <w:pPr>
-        <w:pStyle w:val="ListBullet"/>
+        <w:spacing w:before="200" w:after="80"/>
       </w:pPr>
       <w:r>
-        <w:t>Engagement contractuel à prendre : maintien des effectifs et continuité des travaux en période estivale (juin à août).</w:t>
+        <w:rPr>
+          <w:b/>
+          <w:color w:val="1F3A5F"/>
+          <w:sz w:val="23"/>
+        </w:rPr>
+        <w:t>6.5 Nettoyage, propreté et gestion des déchets</w:t>
       </w:r>
     </w:p>
+    <w:tbl>
+      <w:tblPr>
+        <w:tblStyle w:val="TableGrid"/>
+        <w:tblW w:type="auto" w:w="0"/>
+        <w:jc w:val="center"/>
+        <w:tblLook w:firstColumn="1" w:firstRow="1" w:lastColumn="0" w:lastRow="0" w:noHBand="0" w:noVBand="1" w:val="04A0"/>
+      </w:tblPr>
+      <w:tblGrid>
+        <w:gridCol w:w="4986"/>
+        <w:gridCol w:w="4986"/>
+      </w:tblGrid>
+      <w:tr>
+        <w:tc>
+          <w:tcPr>
+            <w:tcW w:type="dxa" w:w="4365"/>
+            <w:shd w:val="clear" w:color="auto" w:fill="2E74B5"/>
+          </w:tcPr>
+          <w:p>
+            <w:r/>
+            <w:r>
+              <w:rPr>
+                <w:b/>
+                <w:color w:val="FFFFFF"/>
+                <w:sz w:val="19"/>
+              </w:rPr>
+              <w:t>Contrainte identifiée dans le DCE</w:t>
+            </w:r>
+          </w:p>
+        </w:tc>
+        <w:tc>
+          <w:tcPr>
+            <w:tcW w:type="dxa" w:w="4422"/>
+            <w:shd w:val="clear" w:color="auto" w:fill="2E74B5"/>
+          </w:tcPr>
+          <w:p>
+            <w:r/>
+            <w:r>
+              <w:rPr>
+                <w:b/>
+                <w:color w:val="FFFFFF"/>
+                <w:sz w:val="19"/>
+              </w:rPr>
+              <w:t>Organisation prévue par France Décoration</w:t>
+            </w:r>
+          </w:p>
+        </w:tc>
+      </w:tr>
+      <w:tr>
+        <w:tc>
+          <w:tcPr>
+            <w:tcW w:type="dxa" w:w="4365"/>
+          </w:tcPr>
+          <w:p>
+            <w:r/>
+            <w:r>
+              <w:rPr>
+                <w:sz w:val="19"/>
+              </w:rPr>
+              <w:t>Nettoyages multiples à la charge du lot en fin de chantier : sols, revêtements verticaux, quincaillerie, appareils sanitaires/électriques, vitres, menuiseries — non rémunérés dans le prix de la peinture mais inclus au prix global forfaitaire (CCTP III.3.03 / IV.7).</w:t>
+            </w:r>
+          </w:p>
+        </w:tc>
+        <w:tc>
+          <w:tcPr>
+            <w:tcW w:type="dxa" w:w="4422"/>
+          </w:tcPr>
+          <w:p>
+            <w:r/>
+            <w:r>
+              <w:rPr>
+                <w:sz w:val="19"/>
+              </w:rPr>
+              <w:t>Équipe dédiée au nettoyage de fin de chantier ; planning de nettoyage journalier des zones d'intervention (balayage, évacuation des déchets/sciure) en plus du nettoyage général avant réception, pour ne jamais gêner la poursuite des autres lots.</w:t>
+            </w:r>
+          </w:p>
+        </w:tc>
+      </w:tr>
+      <w:tr>
+        <w:tc>
+          <w:tcPr>
+            <w:tcW w:type="dxa" w:w="4365"/>
+          </w:tcPr>
+          <w:p>
+            <w:r/>
+            <w:r>
+              <w:rPr>
+                <w:sz w:val="19"/>
+              </w:rPr>
+              <w:t>Interdiction de ponçage sur revêtements émaillés/stratifiés/lamifiés et appareils sanitaires ; produits de nettoyage à adapter pour ne pas altérer les surfaces.</w:t>
+            </w:r>
+          </w:p>
+        </w:tc>
+        <w:tc>
+          <w:tcPr>
+            <w:tcW w:type="dxa" w:w="4422"/>
+          </w:tcPr>
+          <w:p>
+            <w:r/>
+            <w:r>
+              <w:rPr>
+                <w:sz w:val="19"/>
+              </w:rPr>
+              <w:t>Sélection des produits et procédés de nettoyage selon prescriptions fabricants, avec fiche produit disponible sur site ; formation des équipes aux surfaces sensibles avant intervention.</w:t>
+            </w:r>
+          </w:p>
+        </w:tc>
+      </w:tr>
+      <w:tr>
+        <w:tc>
+          <w:tcPr>
+            <w:tcW w:type="dxa" w:w="4365"/>
+          </w:tcPr>
+          <w:p>
+            <w:r/>
+            <w:r>
+              <w:rPr>
+                <w:sz w:val="19"/>
+              </w:rPr>
+              <w:t>Gestion et traçabilité des déchets de chantier : le titulaire est « détenteur » de ses déchets pendant la durée du chantier et responsable de leur collecte/transport/évacuation conformes.</w:t>
+            </w:r>
+          </w:p>
+        </w:tc>
+        <w:tc>
+          <w:tcPr>
+            <w:tcW w:type="dxa" w:w="4422"/>
+          </w:tcPr>
+          <w:p>
+            <w:r/>
+            <w:r>
+              <w:rPr>
+                <w:sz w:val="19"/>
+              </w:rPr>
+              <w:t>Tri sélectif sur site par filière (DIB, DEEE, déchets dangereux le cas échéant) ; bordereaux de suivi de déchets (BSD) conservés et transmis ; recours à des filières agréées — éléments repris dans le volet environnemental du mémoire technique (indicateurs de suivi, économie circulaire).</w:t>
+            </w:r>
+          </w:p>
+        </w:tc>
+      </w:tr>
+      <w:tr>
+        <w:tc>
+          <w:tcPr>
+            <w:tcW w:type="dxa" w:w="4365"/>
+          </w:tcPr>
+          <w:p>
+            <w:r/>
+            <w:r>
+              <w:rPr>
+                <w:sz w:val="19"/>
+              </w:rPr>
+              <w:t>Dépôt des gravois autorisé uniquement dans les zones prescrites (pénalité de 200 €/infraction) ; retard d'évacuation pénalisé (200 €/j).</w:t>
+            </w:r>
+          </w:p>
+        </w:tc>
+        <w:tc>
+          <w:tcPr>
+            <w:tcW w:type="dxa" w:w="4422"/>
+          </w:tcPr>
+          <w:p>
+            <w:r/>
+            <w:r>
+              <w:rPr>
+                <w:sz w:val="19"/>
+              </w:rPr>
+              <w:t>Zone de stockage déchets/gravois définie avec le Maître d'Œuvre dès la période de préparation ; rotation d'évacuation planifiée pour éviter toute accumulation.</w:t>
+            </w:r>
+          </w:p>
+        </w:tc>
+      </w:tr>
+    </w:tbl>
+    <w:p/>
+    <w:p>
+      <w:pPr>
+        <w:spacing w:before="200" w:after="80"/>
+      </w:pPr>
+      <w:r>
+        <w:rPr>
+          <w:b/>
+          <w:color w:val="1F3A5F"/>
+          <w:sz w:val="23"/>
+        </w:rPr>
+        <w:t>6.6 Garanties et suivi qualité</w:t>
+      </w:r>
+    </w:p>
+    <w:tbl>
+      <w:tblPr>
+        <w:tblStyle w:val="TableGrid"/>
+        <w:tblW w:type="auto" w:w="0"/>
+        <w:jc w:val="center"/>
+        <w:tblLook w:firstColumn="1" w:firstRow="1" w:lastColumn="0" w:lastRow="0" w:noHBand="0" w:noVBand="1" w:val="04A0"/>
+      </w:tblPr>
+      <w:tblGrid>
+        <w:gridCol w:w="4986"/>
+        <w:gridCol w:w="4986"/>
+      </w:tblGrid>
+      <w:tr>
+        <w:tc>
+          <w:tcPr>
+            <w:tcW w:type="dxa" w:w="4365"/>
+            <w:shd w:val="clear" w:color="auto" w:fill="2E74B5"/>
+          </w:tcPr>
+          <w:p>
+            <w:r/>
+            <w:r>
+              <w:rPr>
+                <w:b/>
+                <w:color w:val="FFFFFF"/>
+                <w:sz w:val="19"/>
+              </w:rPr>
+              <w:t>Contrainte identifiée dans le DCE</w:t>
+            </w:r>
+          </w:p>
+        </w:tc>
+        <w:tc>
+          <w:tcPr>
+            <w:tcW w:type="dxa" w:w="4422"/>
+            <w:shd w:val="clear" w:color="auto" w:fill="2E74B5"/>
+          </w:tcPr>
+          <w:p>
+            <w:r/>
+            <w:r>
+              <w:rPr>
+                <w:b/>
+                <w:color w:val="FFFFFF"/>
+                <w:sz w:val="19"/>
+              </w:rPr>
+              <w:t>Organisation prévue par France Décoration</w:t>
+            </w:r>
+          </w:p>
+        </w:tc>
+      </w:tr>
+      <w:tr>
+        <w:tc>
+          <w:tcPr>
+            <w:tcW w:type="dxa" w:w="4365"/>
+          </w:tcPr>
+          <w:p>
+            <w:r/>
+            <w:r>
+              <w:rPr>
+                <w:sz w:val="19"/>
+              </w:rPr>
+              <w:t>Garantie particulière de 10 ans sur les systèmes de peinture appliqués sur maçonnerie, enduits et serrurerie.</w:t>
+            </w:r>
+          </w:p>
+        </w:tc>
+        <w:tc>
+          <w:tcPr>
+            <w:tcW w:type="dxa" w:w="4422"/>
+          </w:tcPr>
+          <w:p>
+            <w:r/>
+            <w:r>
+              <w:rPr>
+                <w:sz w:val="19"/>
+              </w:rPr>
+              <w:t>Mise en œuvre strictement conforme aux préconisations du fabricant (préparation des supports, nombre de couches) ; contrôle qualité formalisé par local ; engagement écrit du fournisseur de peinture sur la tenue du système.</w:t>
+            </w:r>
+          </w:p>
+        </w:tc>
+      </w:tr>
+      <w:tr>
+        <w:tc>
+          <w:tcPr>
+            <w:tcW w:type="dxa" w:w="4365"/>
+          </w:tcPr>
+          <w:p>
+            <w:r/>
+            <w:r>
+              <w:rPr>
+                <w:sz w:val="19"/>
+              </w:rPr>
+              <w:t>Garantie décennale d'indécollabilité des revêtements de sols souples.</w:t>
+            </w:r>
+          </w:p>
+        </w:tc>
+        <w:tc>
+          <w:tcPr>
+            <w:tcW w:type="dxa" w:w="4422"/>
+          </w:tcPr>
+          <w:p>
+            <w:r/>
+            <w:r>
+              <w:rPr>
+                <w:sz w:val="19"/>
+              </w:rPr>
+              <w:t>Contrôle systématique du taux d'humidité des supports avant pose, ragréage conforme (Nivdur S ou équivalent, ≥3mm), respect des préconisations de pose du fabricant, procès-verbal de contrôle conservé au dossier.</w:t>
+            </w:r>
+          </w:p>
+        </w:tc>
+      </w:tr>
+      <w:tr>
+        <w:tc>
+          <w:tcPr>
+            <w:tcW w:type="dxa" w:w="4365"/>
+          </w:tcPr>
+          <w:p>
+            <w:r/>
+            <w:r>
+              <w:rPr>
+                <w:sz w:val="19"/>
+              </w:rPr>
+              <w:t>Obligation d'entretien à la charge de l'entreprise pendant le délai de garantie d'un an (parfait achèvement).</w:t>
+            </w:r>
+          </w:p>
+        </w:tc>
+        <w:tc>
+          <w:tcPr>
+            <w:tcW w:type="dxa" w:w="4422"/>
+          </w:tcPr>
+          <w:p>
+            <w:r/>
+            <w:r>
+              <w:rPr>
+                <w:sz w:val="19"/>
+              </w:rPr>
+              <w:t>Levée des réserves organisée sous délai court après réception ; astreinte/point de contact dédié pendant la période de garantie.</w:t>
+            </w:r>
+          </w:p>
+        </w:tc>
+      </w:tr>
+    </w:tbl>
+    <w:p/>
     <w:p>
       <w:r>
         <w:br w:type="page"/>
@@ -3238,7 +4330,7 @@
           <w:color w:val="2E74B5"/>
           <w:sz w:val="28"/>
         </w:rPr>
-        <w:t>7. Points de vigilance et recommandations pour la remise d'offre</w:t>
+        <w:t>7. Points de vigilance transverses pour la remise d'offre</w:t>
       </w:r>
     </w:p>
     <w:p>
@@ -3246,7 +4338,7 @@
         <w:pStyle w:val="ListBullet"/>
       </w:pPr>
       <w:r>
-        <w:t>Le mémoire technique pèse 60% de la note : soigner particulièrement le volet « démarche environnementale » (15% à lui seul) — méthodologie de réduction des impacts, gestion des déchets/économie circulaire, indicateurs de suivi — ainsi que la description de la méthodologie d'intervention en site hospitalier en activité.</w:t>
+        <w:t>Le mémoire technique pèse 60% de la note : la matrice « contraintes / organisation » ci-dessus (section 6) doit en constituer l'ossature, en particulier le volet « démarche environnementale » qui pèse 15% à lui seul.</w:t>
       </w:r>
     </w:p>
     <w:p>
@@ -3262,7 +4354,7 @@
         <w:pStyle w:val="ListBullet"/>
       </w:pPr>
       <w:r>
-        <w:t>Chiffrer une marge de sécurité sur le planning (45 jours) compte tenu de la dépendance aux lots 1/4/5 et du risque de glissement lié au renfort structurel préalable.</w:t>
+        <w:t>Chiffrer une marge de sécurité sur le planning (45 jours) et sur le risque structurel (report possible faute de renfort réceptionné) plutôt que de l'absorber silencieusement dans le prix.</w:t>
       </w:r>
     </w:p>
     <w:p>
@@ -3270,7 +4362,7 @@
         <w:pStyle w:val="ListBullet"/>
       </w:pPr>
       <w:r>
-        <w:t>Intégrer dans le prix les garanties particulières à 10 ans (peinture) et l'entretien pendant la période de garantie d'un an, ainsi que les provisions du CCTP (jouées 20 ml, grilles 5 u., dépose/repose 67 m², reprise peinture circulation N°5 70 m²).</w:t>
+        <w:t>Intégrer dans le prix les garanties particulières à 10 ans (peinture) et les provisions du CCTP (jouées 20 ml, grilles 5 u., dépose/repose 67 m², reprise peinture circulation N°5 70 m²).</w:t>
       </w:r>
     </w:p>
     <w:p>

</xml_diff>